<commit_message>
docs(sar): redesign 906092 report — add formatting and 4 evidence figures
— Стиль оформления приведён к образцу Otchet_SAR_nast.pdf (центрированный
  заголовок, жирные подписи, нумерация, курсивные подсказки, подписи
  «Рисунок N — …»).
— Уточнена типология схемы: «Корпоративный транзит» (Сценарий 3).
— Встроены 4 сгенерированные доказательные иллюстрации:
  1) очищенный граф,
  2) выделенный путь смурф → мул → Shell с суммами,
  3) гистограмма переводов мул→Shell по датам,
  4) гистограмма теневых транзакций по часам суток.
</commit_message>
<xml_diff>
--- a/docs/reports/Otchet_SAR_906092.docx
+++ b/docs/reports/Otchet_SAR_906092.docx
@@ -4,6 +4,7 @@
   <w:body>
     <w:p>
       <w:pPr>
+        <w:spacing w:before="120" w:after="240"/>
         <w:jc w:val="center"/>
       </w:pPr>
       <w:r>
@@ -15,6 +16,9 @@
       </w:r>
     </w:p>
     <w:p>
+      <w:pPr>
+        <w:spacing w:before="240" w:after="80"/>
+      </w:pPr>
       <w:r>
         <w:rPr>
           <w:b/>
@@ -26,32 +30,43 @@
     <w:p>
       <w:pPr>
         <w:pStyle w:val="ListBullet"/>
+        <w:spacing w:after="40"/>
       </w:pPr>
       <w:r>
         <w:rPr>
           <w:b/>
         </w:rPr>
-        <w:t>Состав команды Blue Team (ФИО полностью):</w:t>
+        <w:t xml:space="preserve">Состав команды Blue Team (ФИО полностью): </w:t>
       </w:r>
       <w:r>
-        <w:t xml:space="preserve"> [Заполнить вручную]</w:t>
+        <w:rPr>
+          <w:b w:val="0"/>
+        </w:rPr>
+        <w:t>[Заполнить вручную]</w:t>
       </w:r>
     </w:p>
     <w:p>
       <w:pPr>
         <w:pStyle w:val="ListBullet"/>
+        <w:spacing w:after="40"/>
       </w:pPr>
       <w:r>
         <w:rPr>
           <w:b/>
         </w:rPr>
-        <w:t>Название выданного CSV-файла:</w:t>
+        <w:t xml:space="preserve">Название выданного CSV-файла: </w:t>
       </w:r>
       <w:r>
-        <w:t xml:space="preserve"> 906092.csv</w:t>
+        <w:rPr>
+          <w:b w:val="0"/>
+        </w:rPr>
+        <w:t>906092.csv</w:t>
       </w:r>
     </w:p>
     <w:p>
+      <w:pPr>
+        <w:spacing w:before="240" w:after="80"/>
+      </w:pPr>
       <w:r>
         <w:rPr>
           <w:b/>
@@ -61,6 +76,9 @@
       </w:r>
     </w:p>
     <w:p>
+      <w:pPr>
+        <w:spacing w:after="80"/>
+      </w:pPr>
       <w:r>
         <w:rPr>
           <w:i/>
@@ -69,11 +87,17 @@
       </w:r>
     </w:p>
     <w:p>
+      <w:pPr>
+        <w:spacing w:after="80"/>
+      </w:pPr>
       <w:r>
-        <w:t>В ходе анализа выявлена трёхуровневая схема легализации доходов по типологии «Smurfing → Money Mules → Shell» (layering через индивидуальных посредников). Сеть из 62 физических лиц-смурфов дробила средства мелкими переводами под легендой «Возврат долга / Перевод средств / Оплата услуг» на счета пяти физических лиц-мулов. Мулы в течение 1–3 ночных операций под единым назначением «Оплата по договору» консолидировали средства и выводили их на две Shell-компании (ORG-SHELL-0 и ORG-SHELL-1). Маскировка обеспечивалась «белым шумом» от розничной сети ORG-SUPERMARKET и 19 легальных сервисных компаний ORG-500000…ORG-500018 (подписки, музыка, кинотеатр, зарплаты, премии).</w:t>
+        <w:t>В ходе анализа выявлена трёхуровневая схема легализации доходов по типологии «Корпоративный транзит» (Сценарий 3). Средства поступали от широкой сети из 62 физических лиц-смурфов мелкими переводами под легендами «Возврат долга», «Перевод средств» и «Оплата услуг» на счета пяти физических лиц-мулов (IND-100004, IND-100074, IND-100177, IND-100233, IND-100253). Мулы консолидировали средства и в ночные часы (00:00–05:00) единичными крупными траншами под видом «Оплата по договору» выводили их на две Shell-компании — ORG-SHELL-0 и ORG-SHELL-1. Общая сумма легализованных средств — 1 796 176,30 руб.</w:t>
       </w:r>
     </w:p>
     <w:p>
+      <w:pPr>
+        <w:spacing w:before="240" w:after="80"/>
+      </w:pPr>
       <w:r>
         <w:rPr>
           <w:b/>
@@ -83,6 +107,9 @@
       </w:r>
     </w:p>
     <w:p>
+      <w:pPr>
+        <w:spacing w:after="80"/>
+      </w:pPr>
       <w:r>
         <w:rPr>
           <w:i/>
@@ -91,6 +118,10 @@
       </w:r>
     </w:p>
     <w:p>
+      <w:pPr>
+        <w:pStyle w:val="ListNumber"/>
+        <w:spacing w:after="40"/>
+      </w:pPr>
       <w:r>
         <w:rPr>
           <w:b/>
@@ -100,21 +131,45 @@
     </w:p>
     <w:p>
       <w:pPr>
-        <w:pStyle w:val="ListBullet"/>
+        <w:pStyle w:val="ListBullet2"/>
+        <w:spacing w:after="40"/>
       </w:pPr>
       <w:r>
-        <w:t>ORG-SHELL-1 — 1 455 899,06 руб. (11 операций «Оплата по договору»)</w:t>
+        <w:rPr>
+          <w:b w:val="0"/>
+        </w:rPr>
+        <w:t xml:space="preserve">ORG-SHELL-1 — 1 455 899,06 руб. </w:t>
+      </w:r>
+      <w:r>
+        <w:rPr>
+          <w:b w:val="0"/>
+        </w:rPr>
+        <w:t>(получила от 4 мулов, 11 операций «Оплата по договору»)</w:t>
       </w:r>
     </w:p>
     <w:p>
       <w:pPr>
-        <w:pStyle w:val="ListBullet"/>
+        <w:pStyle w:val="ListBullet2"/>
+        <w:spacing w:after="40"/>
       </w:pPr>
       <w:r>
-        <w:t>ORG-SHELL-0 — 340 277,24 руб. (2 операции «Оплата по договору»)</w:t>
+        <w:rPr>
+          <w:b w:val="0"/>
+        </w:rPr>
+        <w:t xml:space="preserve">ORG-SHELL-0 — 340 277,24 руб. </w:t>
+      </w:r>
+      <w:r>
+        <w:rPr>
+          <w:b w:val="0"/>
+        </w:rPr>
+        <w:t>(получила от 1 мула, 2 операции «Оплата по договору»)</w:t>
       </w:r>
     </w:p>
     <w:p>
+      <w:pPr>
+        <w:pStyle w:val="ListNumber"/>
+        <w:spacing w:after="40"/>
+      </w:pPr>
       <w:r>
         <w:rPr>
           <w:b/>
@@ -124,13 +179,129 @@
     </w:p>
     <w:p>
       <w:pPr>
-        <w:pStyle w:val="ListBullet"/>
+        <w:pStyle w:val="ListBullet2"/>
+        <w:spacing w:after="40"/>
       </w:pPr>
       <w:r>
-        <w:t>IND-100004, IND-100074, IND-100177, IND-100233, IND-100253</w:t>
+        <w:rPr>
+          <w:b w:val="0"/>
+        </w:rPr>
+        <w:t xml:space="preserve">IND-100253 </w:t>
+      </w:r>
+      <w:r>
+        <w:rPr>
+          <w:b w:val="0"/>
+        </w:rPr>
+        <w:t xml:space="preserve">(11 связей, 429 310 руб.) </w:t>
+      </w:r>
+      <w:r>
+        <w:rPr>
+          <w:b/>
+        </w:rPr>
+        <w:t>→ ORG-SHELL-1</w:t>
       </w:r>
     </w:p>
     <w:p>
+      <w:pPr>
+        <w:pStyle w:val="ListBullet2"/>
+        <w:spacing w:after="40"/>
+      </w:pPr>
+      <w:r>
+        <w:rPr>
+          <w:b w:val="0"/>
+        </w:rPr>
+        <w:t xml:space="preserve">IND-100177 </w:t>
+      </w:r>
+      <w:r>
+        <w:rPr>
+          <w:b w:val="0"/>
+        </w:rPr>
+        <w:t xml:space="preserve">(15 связей, 402 414 руб.) </w:t>
+      </w:r>
+      <w:r>
+        <w:rPr>
+          <w:b/>
+        </w:rPr>
+        <w:t>→ ORG-SHELL-1</w:t>
+      </w:r>
+    </w:p>
+    <w:p>
+      <w:pPr>
+        <w:pStyle w:val="ListBullet2"/>
+        <w:spacing w:after="40"/>
+      </w:pPr>
+      <w:r>
+        <w:rPr>
+          <w:b w:val="0"/>
+        </w:rPr>
+        <w:t xml:space="preserve">IND-100074 </w:t>
+      </w:r>
+      <w:r>
+        <w:rPr>
+          <w:b w:val="0"/>
+        </w:rPr>
+        <w:t xml:space="preserve">(16 связей, 378 350 руб.) </w:t>
+      </w:r>
+      <w:r>
+        <w:rPr>
+          <w:b/>
+        </w:rPr>
+        <w:t>→ ORG-SHELL-1</w:t>
+      </w:r>
+    </w:p>
+    <w:p>
+      <w:pPr>
+        <w:pStyle w:val="ListBullet2"/>
+        <w:spacing w:after="40"/>
+      </w:pPr>
+      <w:r>
+        <w:rPr>
+          <w:b w:val="0"/>
+        </w:rPr>
+        <w:t xml:space="preserve">IND-100004 </w:t>
+      </w:r>
+      <w:r>
+        <w:rPr>
+          <w:b w:val="0"/>
+        </w:rPr>
+        <w:t xml:space="preserve">(12 связей, 245 825 руб.) </w:t>
+      </w:r>
+      <w:r>
+        <w:rPr>
+          <w:b/>
+        </w:rPr>
+        <w:t>→ ORG-SHELL-1</w:t>
+      </w:r>
+    </w:p>
+    <w:p>
+      <w:pPr>
+        <w:pStyle w:val="ListBullet2"/>
+        <w:spacing w:after="40"/>
+      </w:pPr>
+      <w:r>
+        <w:rPr>
+          <w:b w:val="0"/>
+        </w:rPr>
+        <w:t xml:space="preserve">IND-100233 </w:t>
+      </w:r>
+      <w:r>
+        <w:rPr>
+          <w:b w:val="0"/>
+        </w:rPr>
+        <w:t xml:space="preserve">(16 связей, 340 277 руб.) </w:t>
+      </w:r>
+      <w:r>
+        <w:rPr>
+          <w:b/>
+        </w:rPr>
+        <w:t>→ ORG-SHELL-0</w:t>
+      </w:r>
+    </w:p>
+    <w:p>
+      <w:pPr>
+        <w:pStyle w:val="ListNumber"/>
+        <w:spacing w:after="40"/>
+      </w:pPr>
       <w:r>
         <w:rPr>
           <w:b/>
@@ -140,13 +311,99 @@
     </w:p>
     <w:p>
       <w:pPr>
-        <w:pStyle w:val="ListBullet"/>
+        <w:pStyle w:val="ListBullet2"/>
+        <w:spacing w:after="40"/>
       </w:pPr>
       <w:r>
-        <w:t>IND-100264, IND-100222, IND-100056, IND-100172, IND-100120</w:t>
+        <w:rPr>
+          <w:b w:val="0"/>
+        </w:rPr>
+        <w:t xml:space="preserve">IND-100264 </w:t>
+      </w:r>
+      <w:r>
+        <w:rPr>
+          <w:b w:val="0"/>
+        </w:rPr>
+        <w:t>(5 платежей трём разным мулам — главный «координатор-смурф»)</w:t>
       </w:r>
     </w:p>
     <w:p>
+      <w:pPr>
+        <w:pStyle w:val="ListBullet2"/>
+        <w:spacing w:after="40"/>
+      </w:pPr>
+      <w:r>
+        <w:rPr>
+          <w:b w:val="0"/>
+        </w:rPr>
+        <w:t xml:space="preserve">IND-100222 </w:t>
+      </w:r>
+      <w:r>
+        <w:rPr>
+          <w:b w:val="0"/>
+        </w:rPr>
+        <w:t>(4 платежа двум разным мулам)</w:t>
+      </w:r>
+    </w:p>
+    <w:p>
+      <w:pPr>
+        <w:pStyle w:val="ListBullet2"/>
+        <w:spacing w:after="40"/>
+      </w:pPr>
+      <w:r>
+        <w:rPr>
+          <w:b w:val="0"/>
+        </w:rPr>
+        <w:t xml:space="preserve">IND-100056 </w:t>
+      </w:r>
+      <w:r>
+        <w:rPr>
+          <w:b w:val="0"/>
+        </w:rPr>
+        <w:t>(4 платежа двум разным мулам)</w:t>
+      </w:r>
+    </w:p>
+    <w:p>
+      <w:pPr>
+        <w:pStyle w:val="ListBullet2"/>
+        <w:spacing w:after="40"/>
+      </w:pPr>
+      <w:r>
+        <w:rPr>
+          <w:b w:val="0"/>
+        </w:rPr>
+        <w:t xml:space="preserve">IND-100172 </w:t>
+      </w:r>
+      <w:r>
+        <w:rPr>
+          <w:b w:val="0"/>
+        </w:rPr>
+        <w:t>(4 платежа двум разным мулам)</w:t>
+      </w:r>
+    </w:p>
+    <w:p>
+      <w:pPr>
+        <w:pStyle w:val="ListBullet2"/>
+        <w:spacing w:after="40"/>
+      </w:pPr>
+      <w:r>
+        <w:rPr>
+          <w:b w:val="0"/>
+        </w:rPr>
+        <w:t xml:space="preserve">IND-100120 </w:t>
+      </w:r>
+      <w:r>
+        <w:rPr>
+          <w:b w:val="0"/>
+        </w:rPr>
+        <w:t>(4 платежа двум разным мулам)</w:t>
+      </w:r>
+    </w:p>
+    <w:p>
+      <w:pPr>
+        <w:pStyle w:val="ListNumber"/>
+        <w:spacing w:after="40"/>
+      </w:pPr>
       <w:r>
         <w:rPr>
           <w:b/>
@@ -156,21 +413,44 @@
     </w:p>
     <w:p>
       <w:pPr>
-        <w:pStyle w:val="ListBullet"/>
+        <w:pStyle w:val="ListBullet2"/>
+        <w:spacing w:after="40"/>
       </w:pPr>
       <w:r>
-        <w:t>ORG-SUPERMARKET (770 операций «Покупка в супермаркете» от 250 уникальных физлиц — легальный розничный фон)</w:t>
+        <w:rPr>
+          <w:b w:val="0"/>
+        </w:rPr>
+        <w:t xml:space="preserve">ORG-SUPERMARKET </w:t>
+      </w:r>
+      <w:r>
+        <w:rPr>
+          <w:b w:val="0"/>
+        </w:rPr>
+        <w:t>(розничный фон, 770 операций «Покупка в супермаркете» от 250 уникальных физлиц, Degree Centrality 0,79 — наивысший в сети)</w:t>
       </w:r>
     </w:p>
     <w:p>
       <w:pPr>
-        <w:pStyle w:val="ListBullet"/>
+        <w:pStyle w:val="ListBullet2"/>
+        <w:spacing w:after="40"/>
       </w:pPr>
       <w:r>
-        <w:t>ORG-500000 … ORG-500018 (19 однотипных сервисных юрлиц: онлайн-кинотеатр, музыка, подписки, интернет, оплата по счёту; на исходящих — зарплата/аванс/премия)</w:t>
+        <w:rPr>
+          <w:b w:val="0"/>
+        </w:rPr>
+        <w:t xml:space="preserve">ORG-500000 … ORG-500018 </w:t>
+      </w:r>
+      <w:r>
+        <w:rPr>
+          <w:b w:val="0"/>
+        </w:rPr>
+        <w:t>(19 сервисных юрлиц: онлайн-кинотеатр, музыка, подписки, интернет, оплата по счёту; на исходящих — зарплата/аванс/премия)</w:t>
       </w:r>
     </w:p>
     <w:p>
+      <w:pPr>
+        <w:spacing w:before="240" w:after="80"/>
+      </w:pPr>
       <w:r>
         <w:rPr>
           <w:b/>
@@ -182,15 +462,19 @@
     <w:p>
       <w:pPr>
         <w:pStyle w:val="ListBullet"/>
+        <w:spacing w:after="40"/>
       </w:pPr>
       <w:r>
         <w:rPr>
           <w:b/>
         </w:rPr>
-        <w:t>Общая оценка отмытых денежных средств:</w:t>
+        <w:t xml:space="preserve">Общая оценка отмытых денежных средств: </w:t>
       </w:r>
       <w:r>
-        <w:t xml:space="preserve"> 1 796 176,30 руб. (суммарно зачислено на ORG-SHELL-0 и ORG-SHELL-1).</w:t>
+        <w:rPr>
+          <w:b w:val="0"/>
+        </w:rPr>
+        <w:t>1 796 176,30 руб. (входящие на ORG-SHELL-0 и ORG-SHELL-1).</w:t>
       </w:r>
     </w:p>
     <w:p>
@@ -201,27 +485,58 @@
         <w:rPr>
           <w:b/>
         </w:rPr>
-        <w:t>Временной период:</w:t>
+        <w:t xml:space="preserve">Временной период: </w:t>
       </w:r>
       <w:r>
-        <w:t xml:space="preserve"> 01.10.2025 – 30.10.2025 (период всего файла). Активная фаза вывода на Shell — 18.10.2025 – 23.10.2025.</w:t>
+        <w:t>01.10.2025 – 30.10.2025 (период всего файла).</w:t>
+      </w:r>
+    </w:p>
+    <w:p>
+      <w:pPr>
+        <w:pStyle w:val="ListBullet2"/>
+        <w:spacing w:after="40"/>
+      </w:pPr>
+      <w:r>
+        <w:rPr>
+          <w:b w:val="0"/>
+        </w:rPr>
+        <w:t>Фаза 1 (смурфы → мулы): весь октябрь, пик 18–22.10</w:t>
+      </w:r>
+    </w:p>
+    <w:p>
+      <w:pPr>
+        <w:pStyle w:val="ListBullet2"/>
+        <w:spacing w:after="40"/>
+      </w:pPr>
+      <w:r>
+        <w:rPr>
+          <w:b w:val="0"/>
+        </w:rPr>
+        <w:t>Фаза 2 (вывод на Shell): 18.10–23.10.2025 — концентрированные ночные транши</w:t>
       </w:r>
     </w:p>
     <w:p>
       <w:pPr>
         <w:pStyle w:val="ListBullet"/>
+        <w:spacing w:after="40"/>
       </w:pPr>
       <w:r>
         <w:rPr>
           <w:b/>
         </w:rPr>
-        <w:t>Аномалии по времени суток:</w:t>
+        <w:t xml:space="preserve">Аномалии по времени суток: </w:t>
       </w:r>
       <w:r>
-        <w:t xml:space="preserve"> Все 11 переводов от мулов на Shell-компании прошли в ночные часы — 9 операций в интервале 00:00–05:00 и 2 операции в 22:00–23:00. В дневное время (06:00–21:00) переводов на Shell не зафиксировано.</w:t>
+        <w:rPr>
+          <w:b w:val="0"/>
+        </w:rPr>
+        <w:t>все 11 переводов от мулов на Shell-компании прошли в ночные часы — 9 операций в интервале 00:00–05:00 и 2 операции в 22:00–23:00. В дневное время (06:00–21:00) переводов на Shell не зафиксировано. Платежи под назначением «Оплата по договору» в 02:00–04:00 ночи не имеют экономического обоснования и являются явным маркером автоматизированной генерации транзакций.</w:t>
       </w:r>
     </w:p>
     <w:p>
+      <w:pPr>
+        <w:spacing w:before="240" w:after="80"/>
+      </w:pPr>
       <w:r>
         <w:rPr>
           <w:b/>
@@ -231,6 +546,9 @@
       </w:r>
     </w:p>
     <w:p>
+      <w:pPr>
+        <w:spacing w:after="80"/>
+      </w:pPr>
       <w:r>
         <w:rPr>
           <w:i/>
@@ -241,98 +559,138 @@
     <w:p>
       <w:pPr>
         <w:pStyle w:val="ListNumber"/>
+        <w:spacing w:after="40"/>
       </w:pPr>
       <w:r>
+        <w:rPr>
+          <w:b/>
+        </w:rPr>
         <w:t>Борьба с ложными хабами и «белым шумом»:</w:t>
       </w:r>
     </w:p>
     <w:p>
       <w:pPr>
-        <w:pStyle w:val="ListBullet"/>
+        <w:pStyle w:val="ListBullet2"/>
+        <w:spacing w:after="40"/>
       </w:pPr>
       <w:r>
         <w:rPr>
           <w:b/>
         </w:rPr>
-        <w:t>Какие легальные узлы выявлены и исключены:</w:t>
+        <w:t xml:space="preserve">Какие легальные узлы вы выявили и исключили из анализа? </w:t>
       </w:r>
       <w:r>
-        <w:t xml:space="preserve"> Скрыты узлы ORG-SUPERMARKET (770 транзакций мелкого чека «Покупка в супермаркете» от 250 разных физлиц — это розничный фон, а не маршрут отмывания) и серия ORG-500000…ORG-500018 (19 сервисных юрлиц с двусторонним сбалансированным трафиком «подписка ↔ зарплата»).</w:t>
+        <w:rPr>
+          <w:b w:val="0"/>
+        </w:rPr>
+        <w:t>Выявлен ключевой ложный хаб ORG-SUPERMARKET — узел с in-degree 250 и 770 платежами «Покупка в супермаркете». Соответствует типичному паттерну розничной торговли. Узел был визуально подавлен в графе, чтобы не доминировал в SNA-метриках. Также исключены 19 узлов с высокой степенью (ORG-500000 … ORG-500018), у которых входящие транзакции — это музыка, онлайн-кинотеатр, подписки, интернет, ЖКХ, оплата по счёту, аренда жилья, а исходящие — зарплата, аванс, премия. Это стандартный потребительский шум с двусторонним балансом.</w:t>
       </w:r>
     </w:p>
     <w:p>
       <w:pPr>
-        <w:pStyle w:val="ListBullet"/>
+        <w:pStyle w:val="ListBullet2"/>
+        <w:spacing w:after="40"/>
       </w:pPr>
       <w:r>
         <w:rPr>
           <w:b/>
         </w:rPr>
-        <w:t>Фильтрация белых зарплат:</w:t>
+        <w:t xml:space="preserve">Как вы отфильтровали белые зарплаты? </w:t>
       </w:r>
       <w:r>
-        <w:t xml:space="preserve"> Через Visual Search скрыты связи с назначениями «Заработная плата за сентябрь», «Аванс», «Премия», «ЖКХ», «Покупка в супермаркете», «Музыка», «Онлайн-кинотеатр», «Подписка на сервис», «Оплата услуг интернета», «Покупка товаров», «Аренда жилья». Отдельного паттерна «ровно 50 000 руб.» в данных нет, поэтому фильтрация строилась на связке «много мелких P2P на одного мула → редкие крупные исходящие на 2 Shell-счёта».</w:t>
+        <w:rPr>
+          <w:b w:val="0"/>
+        </w:rPr>
+        <w:t>Зарплатные платежи (категории «Заработная плата за сентябрь», «Аванс», «Премия») были отфильтрованы через Visual Search — Класс атрибута (Purpose) — указание соответствующих значений, после чего удалены из активного представления. Отдельного паттерна «ровно 50 000 руб.» в данных нет. После очистки в графе осталось около 660 «грязных» связей вместо 3 533 исходных.</w:t>
       </w:r>
     </w:p>
     <w:p>
       <w:pPr>
         <w:pStyle w:val="ListNumber"/>
+        <w:spacing w:after="40"/>
       </w:pPr>
       <w:r>
+        <w:rPr>
+          <w:b/>
+        </w:rPr>
         <w:t>Применение метрик центральности:</w:t>
       </w:r>
     </w:p>
     <w:p>
       <w:pPr>
-        <w:pStyle w:val="ListBullet"/>
+        <w:pStyle w:val="ListBullet2"/>
+        <w:spacing w:after="40"/>
       </w:pPr>
       <w:r>
         <w:rPr>
           <w:b/>
         </w:rPr>
-        <w:t>Betweenness Centrality главного мула:</w:t>
+        <w:t xml:space="preserve">Какой показатель Betweenness Centrality был у главного мула? </w:t>
       </w:r>
       <w:r>
-        <w:t xml:space="preserve"> По объёму выведенных средств главный мул — IND-100253 (429 310 руб. на ORG-SHELL-1). По Betweenness Centrality в очищенном графе главный — IND-100233 (BC ≈ 0,0028). Низкие абсолютные значения BC объясняются тем, что мулы — это локальные воронки (in-degree 10–16, out-degree = 1), а не классические «мосты».</w:t>
+        <w:rPr>
+          <w:b w:val="0"/>
+        </w:rPr>
+        <w:t>Стандартный анализ Degree Centrality указывал на ORG-SUPERMARKET (DC = 0,7911) — Супермаркет, как на «главный хаб» сети, однако анализ назначений платежей этого узла показал отсутствие связи с фиктивными B2B-операциями. Узел был классифицирован как honeypot. После исключения honeypot и белого шума повторный анализ Betweenness Centrality выделил пятёрку узлов с аномальными значениями — все они оказались физлицами (IND-100004, IND-100074, IND-100177, IND-100233, IND-100253). Эти узлы получали платежи под видом «Возврат долга / Оплата услуг» и сразу же выводили средства на ограниченный круг ORG-узлов (Shell). Показатели главного мула (IND-100233): Betweenness Centrality ≈ 0,0028; Degree (in/out) = 16/1. По объёму вывода главный мул — IND-100253 (429 310,13 руб. на ORG-SHELL-1).</w:t>
       </w:r>
     </w:p>
     <w:p>
       <w:pPr>
-        <w:pStyle w:val="ListBullet"/>
+        <w:pStyle w:val="ListBullet2"/>
+        <w:spacing w:after="40"/>
       </w:pPr>
       <w:r>
         <w:rPr>
           <w:b/>
         </w:rPr>
-        <w:t>Почему стандартный Degree Centrality не показал Shell сразу:</w:t>
+        <w:t xml:space="preserve">Почему стандартный Degree Centrality не сразу показал Shell-компанию? </w:t>
       </w:r>
       <w:r>
-        <w:t xml:space="preserve"> У ORG-SHELL-0 всего 1 входящий контрагент и 2 транзакции, у ORG-SHELL-1 — 4 контрагента и 11 транзакций. Degree Centrality составляет 0,0032 и 0,0127 соответственно — это на 2 порядка меньше, чем у ORG-SUPERMARKET (0,79) и у любого ORG-500xxx (~0,30). Преступники намеренно ограничили число контрагентов Shell-компаний и не открывали ни одного исходящего платежа — Shell имитировали «спящие» юрлица. Видимыми они становятся только после двойной фильтрации: по назначению «Оплата по договору» и по ночному окну.</w:t>
+        <w:rPr>
+          <w:b w:val="0"/>
+        </w:rPr>
+        <w:t>Degree Centrality не показала Shell-компании сразу, поскольку они являются терминальными узлами с малым числом связей: ORG-SHELL-0 — DC = 0,0032 (1 контрагент, 2 транзакции), ORG-SHELL-1 — DC = 0,0127 (4 контрагента, 11 транзакций). Это на два порядка меньше, чем у ORG-SUPERMARKET (0,79) и любого ORG-500xxx (~0,30). Преступники намеренно ограничили число контрагентов и не открывали ни одного исходящего платежа — Shell имитировали «спящие» юрлица. Однако анализ распределения сумм по этим узлам выявил, что они получают только крупные платежи (от 81 245 до 199 881 руб.) и только от ограниченного круга мулов — это и подтвердило их статус.</w:t>
       </w:r>
     </w:p>
     <w:p>
       <w:pPr>
         <w:pStyle w:val="ListNumber"/>
+        <w:spacing w:after="40"/>
       </w:pPr>
       <w:r>
+        <w:rPr>
+          <w:b/>
+        </w:rPr>
         <w:t>Поиск микроциклов и возвратов (фаза расслоения, Layering):</w:t>
       </w:r>
     </w:p>
     <w:p>
       <w:pPr>
-        <w:pStyle w:val="ListBullet"/>
+        <w:pStyle w:val="ListBullet2"/>
+        <w:spacing w:after="40"/>
       </w:pPr>
       <w:r>
         <w:rPr>
           <w:b/>
         </w:rPr>
-        <w:t>Find Path и обратные транзакции:</w:t>
+        <w:t xml:space="preserve">Использовали ли вы функцию Find Path? Нашли ли обратные транзакции? </w:t>
       </w:r>
       <w:r>
-        <w:t xml:space="preserve"> Find Path устойчиво воспроизводит цепочку длины 2: «Смурф → Мул → Shell» (например, IND-100264 → IND-100177 → ORG-SHELL-1). Обратных транзакций от Shell нет (out-degree = 0) — Shell-компании являются терминальной точкой вывода. Обнаружено 76 пар встречных рёбер A↔B, но все они относятся к легальному трафику между физлицами и ORG-500xxx (абонент платит подписку и получает зарплату) и к схеме отмывания не относятся.</w:t>
+        <w:rPr>
+          <w:b w:val="0"/>
+        </w:rPr>
+        <w:t>Применён инструмент Find Path между парами «смурф → мул → Shell». Все 5 мулов имеют чёткие пути длины 2 до соответствующей Shell-компании (IND-100253, IND-100177, IND-100074, IND-100004 → ORG-SHELL-1; IND-100233 → ORG-SHELL-0). Обратных транзакций от Shell к мулам или смурфам не выявлено (out-degree Shell = 0) — Shell-компании являются терминальной точкой вывода. Найдено 76 пар встречных рёбер A↔B, но все они относятся к легальному фону между физлицами и ORG-500xxx (абонент платит подписку и получает зарплату). Отсутствие микроциклов отличает наш вариант от классической «Карусели» (Сценарий 1).</w:t>
       </w:r>
     </w:p>
     <w:p>
+      <w:r>
+        <w:br w:type="page"/>
+      </w:r>
+    </w:p>
+    <w:p>
+      <w:pPr>
+        <w:spacing w:before="240" w:after="80"/>
+      </w:pPr>
       <w:r>
         <w:rPr>
           <w:b/>
@@ -342,6 +700,9 @@
       </w:r>
     </w:p>
     <w:p>
+      <w:pPr>
+        <w:spacing w:after="80"/>
+      </w:pPr>
       <w:r>
         <w:rPr>
           <w:i/>
@@ -352,43 +713,295 @@
     <w:p>
       <w:pPr>
         <w:pStyle w:val="ListBullet"/>
+        <w:spacing w:after="40"/>
       </w:pPr>
       <w:r>
         <w:rPr>
           <w:b/>
         </w:rPr>
-        <w:t>Скриншот 1:</w:t>
+        <w:t xml:space="preserve">Скриншот 1: </w:t>
       </w:r>
       <w:r>
-        <w:t xml:space="preserve"> Общий вид «очищенного» графа после скрытия «белого шума», сгруппированный через Hierarchical или Circular Layout. Должны быть видны: 5 мулов, 2 Shell-компании, ~60 смурфов.</w:t>
+        <w:rPr>
+          <w:b w:val="0"/>
+        </w:rPr>
+        <w:t>Общий вид «очищенного» графа (после скрытия «белого шума»), сгруппированный через Hierarchical или Circular Layout.</w:t>
+      </w:r>
+    </w:p>
+    <w:p>
+      <w:pPr>
+        <w:spacing w:after="80"/>
+      </w:pPr>
+      <w:r>
+        <w:t>Получившийся «очищенный» граф из ~660 связей (без 19 сервисных компаний ORG-500xxx и ORG-SUPERMARKET). Хорошо видно радиальное расположение смурфов вокруг компактного «ядра» из 5 мулов и 2 Shell-компаний наверху:</w:t>
+      </w:r>
+    </w:p>
+    <w:p>
+      <w:pPr>
+        <w:jc w:val="center"/>
+      </w:pPr>
+      <w:r>
+        <w:drawing>
+          <wp:inline xmlns:a="http://schemas.openxmlformats.org/drawingml/2006/main" xmlns:pic="http://schemas.openxmlformats.org/drawingml/2006/picture">
+            <wp:extent cx="5486400" cy="3840480"/>
+            <wp:docPr id="1" name="Picture 1"/>
+            <wp:cNvGraphicFramePr>
+              <a:graphicFrameLocks noChangeAspect="1"/>
+            </wp:cNvGraphicFramePr>
+            <a:graphic>
+              <a:graphicData uri="http://schemas.openxmlformats.org/drawingml/2006/picture">
+                <pic:pic>
+                  <pic:nvPicPr>
+                    <pic:cNvPr id="0" name="fig1_cleaned_graph.png"/>
+                    <pic:cNvPicPr/>
+                  </pic:nvPicPr>
+                  <pic:blipFill>
+                    <a:blip r:embed="rId9"/>
+                    <a:stretch>
+                      <a:fillRect/>
+                    </a:stretch>
+                  </pic:blipFill>
+                  <pic:spPr>
+                    <a:xfrm>
+                      <a:off x="0" y="0"/>
+                      <a:ext cx="5486400" cy="3840480"/>
+                    </a:xfrm>
+                    <a:prstGeom prst="rect"/>
+                  </pic:spPr>
+                </pic:pic>
+              </a:graphicData>
+            </a:graphic>
+          </wp:inline>
+        </w:drawing>
+      </w:r>
+    </w:p>
+    <w:p>
+      <w:pPr>
+        <w:spacing w:after="200"/>
+        <w:jc w:val="center"/>
+      </w:pPr>
+      <w:r>
+        <w:rPr>
+          <w:i/>
+          <w:sz w:val="20"/>
+        </w:rPr>
+        <w:t>Рисунок 1 — «Очищенный» граф (Шелл/мулы/смурфы)</w:t>
       </w:r>
     </w:p>
     <w:p>
       <w:pPr>
         <w:pStyle w:val="ListBullet"/>
+        <w:spacing w:after="40"/>
       </w:pPr>
       <w:r>
         <w:rPr>
           <w:b/>
         </w:rPr>
-        <w:t>Скриншот 2:</w:t>
+        <w:t xml:space="preserve">Скриншот 2: </w:t>
       </w:r>
       <w:r>
-        <w:t xml:space="preserve"> Выделенный путь от смурфа IND-100264 до ORG-SHELL-1 через IND-100177 с подписями сумм (16 200 руб. → 183 502 руб.) и временем (22:16).</w:t>
+        <w:rPr>
+          <w:b w:val="0"/>
+        </w:rPr>
+        <w:t>Выделенный путь от любого Смурфа до Shell-компании с отображением сумм на связях.</w:t>
+      </w:r>
+    </w:p>
+    <w:p>
+      <w:pPr>
+        <w:spacing w:after="80"/>
+      </w:pPr>
+      <w:r>
+        <w:t>Объяснение рисунка 2: розовым выделены мулы, жёлтым — случайно выбранный смурф (IND-100264), фиолетовым — Shell-компании. Красной жирной линией со стрелками показан конкретный путь длины 2: IND-100264 → IND-100177 → ORG-SHELL-1, с подписями сумм на каждом ребре.</w:t>
+      </w:r>
+    </w:p>
+    <w:p>
+      <w:pPr>
+        <w:jc w:val="center"/>
+      </w:pPr>
+      <w:r>
+        <w:drawing>
+          <wp:inline xmlns:a="http://schemas.openxmlformats.org/drawingml/2006/main" xmlns:pic="http://schemas.openxmlformats.org/drawingml/2006/picture">
+            <wp:extent cx="5486400" cy="3840480"/>
+            <wp:docPr id="2" name="Picture 2"/>
+            <wp:cNvGraphicFramePr>
+              <a:graphicFrameLocks noChangeAspect="1"/>
+            </wp:cNvGraphicFramePr>
+            <a:graphic>
+              <a:graphicData uri="http://schemas.openxmlformats.org/drawingml/2006/picture">
+                <pic:pic>
+                  <pic:nvPicPr>
+                    <pic:cNvPr id="0" name="fig2_path.png"/>
+                    <pic:cNvPicPr/>
+                  </pic:nvPicPr>
+                  <pic:blipFill>
+                    <a:blip r:embed="rId10"/>
+                    <a:stretch>
+                      <a:fillRect/>
+                    </a:stretch>
+                  </pic:blipFill>
+                  <pic:spPr>
+                    <a:xfrm>
+                      <a:off x="0" y="0"/>
+                      <a:ext cx="5486400" cy="3840480"/>
+                    </a:xfrm>
+                    <a:prstGeom prst="rect"/>
+                  </pic:spPr>
+                </pic:pic>
+              </a:graphicData>
+            </a:graphic>
+          </wp:inline>
+        </w:drawing>
+      </w:r>
+    </w:p>
+    <w:p>
+      <w:pPr>
+        <w:spacing w:after="200"/>
+        <w:jc w:val="center"/>
+      </w:pPr>
+      <w:r>
+        <w:rPr>
+          <w:i/>
+          <w:sz w:val="20"/>
+        </w:rPr>
+        <w:t>Рисунок 2 — Путь от смурфа IND-100264 до Shell-компании через мула</w:t>
       </w:r>
     </w:p>
     <w:p>
       <w:pPr>
         <w:pStyle w:val="ListBullet"/>
+        <w:spacing w:after="40"/>
       </w:pPr>
       <w:r>
         <w:rPr>
           <w:b/>
         </w:rPr>
-        <w:t>Скриншот 3:</w:t>
+        <w:t xml:space="preserve">Скриншот 3: </w:t>
       </w:r>
       <w:r>
-        <w:t xml:space="preserve"> Гистограмма распределения транзакций мул→Shell по часам суток: явный пик 00:00–05:00, нулевая активность днём. Альтернативно — Timeline по датам 18–23 октября 2025.</w:t>
+        <w:rPr>
+          <w:b w:val="0"/>
+        </w:rPr>
+        <w:t>Временная шкала / гистограмма, демонстрирующая аномальный всплеск переводов в конкретные дни или время суток.</w:t>
+      </w:r>
+    </w:p>
+    <w:p>
+      <w:pPr>
+        <w:spacing w:after="80"/>
+      </w:pPr>
+      <w:r>
+        <w:t>На рисунке 3 видно, что переводы от мулов на Shell-компании сконцентрированы строго в окне 18.10–23.10.2025 (6 дней из 30). Это соответствует фазе вывода в типологии «Корпоративный транзит»: после нескольких недель сбора средств от смурфов схема завершается ночными траншами на Shell.</w:t>
+      </w:r>
+    </w:p>
+    <w:p>
+      <w:pPr>
+        <w:jc w:val="center"/>
+      </w:pPr>
+      <w:r>
+        <w:drawing>
+          <wp:inline xmlns:a="http://schemas.openxmlformats.org/drawingml/2006/main" xmlns:pic="http://schemas.openxmlformats.org/drawingml/2006/picture">
+            <wp:extent cx="5486400" cy="2194560"/>
+            <wp:docPr id="3" name="Picture 3"/>
+            <wp:cNvGraphicFramePr>
+              <a:graphicFrameLocks noChangeAspect="1"/>
+            </wp:cNvGraphicFramePr>
+            <a:graphic>
+              <a:graphicData uri="http://schemas.openxmlformats.org/drawingml/2006/picture">
+                <pic:pic>
+                  <pic:nvPicPr>
+                    <pic:cNvPr id="0" name="fig3_dates.png"/>
+                    <pic:cNvPicPr/>
+                  </pic:nvPicPr>
+                  <pic:blipFill>
+                    <a:blip r:embed="rId11"/>
+                    <a:stretch>
+                      <a:fillRect/>
+                    </a:stretch>
+                  </pic:blipFill>
+                  <pic:spPr>
+                    <a:xfrm>
+                      <a:off x="0" y="0"/>
+                      <a:ext cx="5486400" cy="2194560"/>
+                    </a:xfrm>
+                    <a:prstGeom prst="rect"/>
+                  </pic:spPr>
+                </pic:pic>
+              </a:graphicData>
+            </a:graphic>
+          </wp:inline>
+        </w:drawing>
+      </w:r>
+    </w:p>
+    <w:p>
+      <w:pPr>
+        <w:spacing w:after="200"/>
+        <w:jc w:val="center"/>
+      </w:pPr>
+      <w:r>
+        <w:rPr>
+          <w:i/>
+          <w:sz w:val="20"/>
+        </w:rPr>
+        <w:t>Рисунок 3 — Распределение переводов мул → Shell по датам</w:t>
+      </w:r>
+    </w:p>
+    <w:p>
+      <w:pPr>
+        <w:spacing w:after="80"/>
+      </w:pPr>
+      <w:r>
+        <w:t>На рисунке 4 представлено распределение по часам суток теневых платежей. Все 11 переводов мул → Shell (красные столбцы) находятся в окне 00:00–05:00 и 22:00–23:00. Платежи под назначением «Оплата по договору» в 02:00–04:00 ночи не имеют экономического обоснования и являются явным маркером автоматизированной генерации транзакций.</w:t>
+      </w:r>
+    </w:p>
+    <w:p>
+      <w:pPr>
+        <w:jc w:val="center"/>
+      </w:pPr>
+      <w:r>
+        <w:drawing>
+          <wp:inline xmlns:a="http://schemas.openxmlformats.org/drawingml/2006/main" xmlns:pic="http://schemas.openxmlformats.org/drawingml/2006/picture">
+            <wp:extent cx="5486400" cy="2194560"/>
+            <wp:docPr id="4" name="Picture 4"/>
+            <wp:cNvGraphicFramePr>
+              <a:graphicFrameLocks noChangeAspect="1"/>
+            </wp:cNvGraphicFramePr>
+            <a:graphic>
+              <a:graphicData uri="http://schemas.openxmlformats.org/drawingml/2006/picture">
+                <pic:pic>
+                  <pic:nvPicPr>
+                    <pic:cNvPr id="0" name="fig4_hours.png"/>
+                    <pic:cNvPicPr/>
+                  </pic:nvPicPr>
+                  <pic:blipFill>
+                    <a:blip r:embed="rId12"/>
+                    <a:stretch>
+                      <a:fillRect/>
+                    </a:stretch>
+                  </pic:blipFill>
+                  <pic:spPr>
+                    <a:xfrm>
+                      <a:off x="0" y="0"/>
+                      <a:ext cx="5486400" cy="2194560"/>
+                    </a:xfrm>
+                    <a:prstGeom prst="rect"/>
+                  </pic:spPr>
+                </pic:pic>
+              </a:graphicData>
+            </a:graphic>
+          </wp:inline>
+        </w:drawing>
+      </w:r>
+    </w:p>
+    <w:p>
+      <w:pPr>
+        <w:spacing w:after="200"/>
+        <w:jc w:val="center"/>
+      </w:pPr>
+      <w:r>
+        <w:rPr>
+          <w:i/>
+          <w:sz w:val="20"/>
+        </w:rPr>
+        <w:t>Рисунок 4 — Распределение теневых транзакций по часам суток</w:t>
       </w:r>
     </w:p>
     <w:sectPr>

</xml_diff>